<commit_message>
Row 20 becomes هَـٰٓؤُلَآءِ, which carries both madds at once
The old row 20 was a second سُوٓءَ, differing from row 17 only in its final
vowel — which the filename derivation strips, so both rows would have pointed
at one recording and one of them would have played the wrong ending. Replaced
with a word that teaches the distinction instead of hiding it: the هَا is
munfasil by origin, then لَآءِ is muttasil inside the word.

Which madd comes first is the whole point of the card, so it gets a chip each
in order — Munfasil (1st), Muttasil (2nd) — rather than a sentence nobody
reads mid-drill. The sentence stays in the (i) for whoever taps it. The rule
is written to fire either way round, so a future word with the order reversed
labels itself correctly.

All 76 recordings now derive 76 distinct filenames.

Co-Authored-By: Claude Opus 5 <noreply@anthropic.com>
</commit_message>
<xml_diff>
--- a/Word Tables/مد متصل ومنفصل قبل همزة.docx
+++ b/Word Tables/مد متصل ومنفصل قبل همزة.docx
@@ -1905,24 +1905,58 @@
               <w:jc w:val="right"/>
               <w:cnfStyle w:val="000000000000" w:firstRow="0" w:lastRow="0" w:firstColumn="0" w:lastColumn="0" w:oddVBand="0" w:evenVBand="0" w:oddHBand="0" w:evenHBand="0" w:firstRowFirstColumn="0" w:firstRowLastColumn="0" w:lastRowFirstColumn="0" w:lastRowLastColumn="0"/>
               <w:rPr>
-                <w:rFonts w:ascii="KFGQPC HAFS Uthmanic Script" w:eastAsiaTheme="majorEastAsia" w:hAnsi="KFGQPC HAFS Uthmanic Script" w:cs="KFGQPC HAFS Uthmanic Script"/>
-                <w:color w:val="0F4761" w:themeColor="accent1" w:themeShade="BF"/>
-                <w:sz w:val="40"/>
-                <w:szCs w:val="40"/>
-                <w:lang w:bidi="ar-EG"/>
-              </w:rPr>
-            </w:pPr>
-            <w:proofErr w:type="spellStart"/>
-            <w:r>
-              <w:rPr>
-                <w:rFonts w:ascii="KFGQPC HAFS Uthmanic Script" w:eastAsiaTheme="majorEastAsia" w:hAnsi="KFGQPC HAFS Uthmanic Script" w:cs="KFGQPC HAFS Uthmanic Script" w:hint="eastAsia"/>
-                <w:color w:val="0F4761" w:themeColor="accent1" w:themeShade="BF"/>
-                <w:sz w:val="40"/>
-                <w:szCs w:val="40"/>
-                <w:rtl/>
-                <w:lang w:bidi="ar-EG"/>
-              </w:rPr>
-              <w:t>سُوٓءَ</w:t>
+                <w:rFonts w:ascii="KFGQPC HAFS Uthmanic Script" w:eastAsiaTheme="majorEastAsia" w:hAnsi="KFGQPC HAFS Uthmanic Script" w:cs="KFGQPC HAFS Uthmanic Script" w:hint="cs"/>
+                <w:color w:val="0F4761" w:themeColor="accent1" w:themeShade="BF"/>
+                <w:sz w:val="40"/>
+                <w:szCs w:val="40"/>
+                <w:rtl/>
+                <w:lang w:bidi="ar-EG"/>
+              </w:rPr>
+            </w:pPr>
+            <w:proofErr w:type="spellStart"/>
+            <w:r>
+              <w:rPr>
+                <w:rFonts w:ascii="KFGQPC HAFS Uthmanic Script" w:eastAsiaTheme="majorEastAsia" w:hAnsi="KFGQPC HAFS Uthmanic Script" w:cs="KFGQPC HAFS Uthmanic Script" w:hint="cs"/>
+                <w:color w:val="0F4761" w:themeColor="accent1" w:themeShade="BF"/>
+                <w:sz w:val="40"/>
+                <w:szCs w:val="40"/>
+                <w:rtl/>
+                <w:lang w:bidi="ar-EG"/>
+              </w:rPr>
+              <w:t>هَـ</w:t>
+            </w:r>
+            <w:r>
+              <w:rPr>
+                <w:rFonts w:ascii="KFGQPC HAFS Uthmanic Script" w:eastAsiaTheme="majorEastAsia" w:hAnsi="KFGQPC HAFS Uthmanic Script" w:cs="KFGQPC HAFS Uthmanic Script"/>
+                <w:color w:val="0F4761" w:themeColor="accent1" w:themeShade="BF"/>
+                <w:sz w:val="40"/>
+                <w:szCs w:val="40"/>
+                <w:rtl/>
+                <w:lang w:bidi="ar-EG"/>
+              </w:rPr>
+              <w:t>ٰ</w:t>
+            </w:r>
+            <w:r>
+              <w:rPr>
+                <w:rFonts w:ascii="KFGQPC HAFS Uthmanic Script" w:eastAsiaTheme="majorEastAsia" w:hAnsi="KFGQPC HAFS Uthmanic Script" w:cs="KFGQPC HAFS Uthmanic Script" w:hint="cs"/>
+                <w:color w:val="0F4761" w:themeColor="accent1" w:themeShade="BF"/>
+                <w:sz w:val="40"/>
+                <w:szCs w:val="40"/>
+                <w:rtl/>
+                <w:lang w:bidi="ar-EG"/>
+              </w:rPr>
+              <w:t>ٓؤُل</w:t>
+            </w:r>
+            <w:r>
+              <w:rPr>
+                <w:rFonts w:ascii="KFGQPC HAFS Uthmanic Script" w:eastAsiaTheme="majorEastAsia" w:hAnsi="KFGQPC HAFS Uthmanic Script" w:cs="KFGQPC HAFS Uthmanic Script"/>
+                <w:color w:val="0F4761" w:themeColor="accent1" w:themeShade="BF"/>
+                <w:sz w:val="40"/>
+                <w:szCs w:val="40"/>
+                <w:rtl/>
+                <w:lang w:bidi="ar-EG"/>
+              </w:rPr>
+              <w:t>آءِ</w:t>
             </w:r>
             <w:proofErr w:type="spellEnd"/>
           </w:p>
@@ -1942,6 +1976,82 @@
                 <w:lang w:bidi="ar-EG"/>
               </w:rPr>
             </w:pPr>
+            <w:r>
+              <w:rPr>
+                <w:rFonts w:ascii="Calibri" w:eastAsiaTheme="majorEastAsia" w:hAnsi="Calibri" w:cs="Calibri"/>
+                <w:color w:val="0F4761" w:themeColor="accent1" w:themeShade="BF"/>
+                <w:sz w:val="22"/>
+                <w:szCs w:val="40"/>
+                <w:lang w:bidi="ar-EG"/>
+              </w:rPr>
+              <w:t xml:space="preserve">The first </w:t>
+            </w:r>
+            <w:proofErr w:type="spellStart"/>
+            <w:r>
+              <w:rPr>
+                <w:rFonts w:ascii="Calibri" w:eastAsiaTheme="majorEastAsia" w:hAnsi="Calibri" w:cs="Calibri"/>
+                <w:color w:val="0F4761" w:themeColor="accent1" w:themeShade="BF"/>
+                <w:sz w:val="22"/>
+                <w:szCs w:val="40"/>
+                <w:lang w:bidi="ar-EG"/>
+              </w:rPr>
+              <w:t>madd</w:t>
+            </w:r>
+            <w:proofErr w:type="spellEnd"/>
+            <w:r>
+              <w:rPr>
+                <w:rFonts w:ascii="Calibri" w:eastAsiaTheme="majorEastAsia" w:hAnsi="Calibri" w:cs="Calibri"/>
+                <w:color w:val="0F4761" w:themeColor="accent1" w:themeShade="BF"/>
+                <w:sz w:val="22"/>
+                <w:szCs w:val="40"/>
+                <w:lang w:bidi="ar-EG"/>
+              </w:rPr>
+              <w:t xml:space="preserve"> is </w:t>
+            </w:r>
+            <w:proofErr w:type="spellStart"/>
+            <w:r>
+              <w:rPr>
+                <w:rFonts w:ascii="Calibri" w:eastAsiaTheme="majorEastAsia" w:hAnsi="Calibri" w:cs="Calibri"/>
+                <w:color w:val="0F4761" w:themeColor="accent1" w:themeShade="BF"/>
+                <w:sz w:val="22"/>
+                <w:szCs w:val="40"/>
+                <w:lang w:bidi="ar-EG"/>
+              </w:rPr>
+              <w:t>munfasil</w:t>
+            </w:r>
+            <w:proofErr w:type="spellEnd"/>
+            <w:r>
+              <w:rPr>
+                <w:rFonts w:ascii="Calibri" w:eastAsiaTheme="majorEastAsia" w:hAnsi="Calibri" w:cs="Calibri"/>
+                <w:color w:val="0F4761" w:themeColor="accent1" w:themeShade="BF"/>
+                <w:sz w:val="22"/>
+                <w:szCs w:val="40"/>
+                <w:lang w:bidi="ar-EG"/>
+              </w:rPr>
+              <w:t xml:space="preserve">, the second is </w:t>
+            </w:r>
+            <w:proofErr w:type="spellStart"/>
+            <w:r>
+              <w:rPr>
+                <w:rFonts w:ascii="Calibri" w:eastAsiaTheme="majorEastAsia" w:hAnsi="Calibri" w:cs="Calibri"/>
+                <w:color w:val="0F4761" w:themeColor="accent1" w:themeShade="BF"/>
+                <w:sz w:val="22"/>
+                <w:szCs w:val="40"/>
+                <w:lang w:bidi="ar-EG"/>
+              </w:rPr>
+              <w:t>mutassil</w:t>
+            </w:r>
+            <w:proofErr w:type="spellEnd"/>
+            <w:r>
+              <w:rPr>
+                <w:rFonts w:ascii="Calibri" w:eastAsiaTheme="majorEastAsia" w:hAnsi="Calibri" w:cs="Calibri"/>
+                <w:color w:val="0F4761" w:themeColor="accent1" w:themeShade="BF"/>
+                <w:sz w:val="22"/>
+                <w:szCs w:val="40"/>
+                <w:lang w:bidi="ar-EG"/>
+              </w:rPr>
+              <w:t>.</w:t>
+            </w:r>
           </w:p>
         </w:tc>
       </w:tr>

</xml_diff>